<commit_message>
Updated Comment_APIS.docx and Ideas.docx. Created Comment_Topic_Sorting.docx.
</commit_message>
<xml_diff>
--- a/Portal_Database_Design/Comment_APIs.docx
+++ b/Portal_Database_Design/Comment_APIs.docx
@@ -16,8 +16,8 @@
         </w:tblCellMar>
       </w:tblPr>
       <w:tblGrid>
-        <w:gridCol w:w="1915"/>
-        <w:gridCol w:w="1940"/>
+        <w:gridCol w:w="1914"/>
+        <w:gridCol w:w="1941"/>
         <w:gridCol w:w="1921"/>
         <w:gridCol w:w="1934"/>
         <w:gridCol w:w="1928"/>
@@ -26,7 +26,7 @@
         <w:trPr/>
         <w:tc>
           <w:tcPr>
-            <w:tcW w:w="1915" w:type="dxa"/>
+            <w:tcW w:w="1914" w:type="dxa"/>
             <w:tcBorders>
               <w:top w:val="single" w:sz="4" w:space="0" w:color="000000"/>
               <w:start w:val="single" w:sz="4" w:space="0" w:color="000000"/>
@@ -48,7 +48,7 @@
         </w:tc>
         <w:tc>
           <w:tcPr>
-            <w:tcW w:w="1940" w:type="dxa"/>
+            <w:tcW w:w="1941" w:type="dxa"/>
             <w:tcBorders>
               <w:top w:val="single" w:sz="4" w:space="0" w:color="000000"/>
               <w:start w:val="single" w:sz="4" w:space="0" w:color="000000"/>
@@ -140,7 +140,7 @@
         <w:trPr/>
         <w:tc>
           <w:tcPr>
-            <w:tcW w:w="1915" w:type="dxa"/>
+            <w:tcW w:w="1914" w:type="dxa"/>
             <w:tcBorders>
               <w:start w:val="single" w:sz="4" w:space="0" w:color="000000"/>
               <w:bottom w:val="single" w:sz="4" w:space="0" w:color="000000"/>
@@ -161,7 +161,7 @@
         </w:tc>
         <w:tc>
           <w:tcPr>
-            <w:tcW w:w="1940" w:type="dxa"/>
+            <w:tcW w:w="1941" w:type="dxa"/>
             <w:tcBorders>
               <w:start w:val="single" w:sz="4" w:space="0" w:color="000000"/>
               <w:bottom w:val="single" w:sz="4" w:space="0" w:color="000000"/>
@@ -249,7 +249,7 @@
         <w:trPr/>
         <w:tc>
           <w:tcPr>
-            <w:tcW w:w="1915" w:type="dxa"/>
+            <w:tcW w:w="1914" w:type="dxa"/>
             <w:tcBorders>
               <w:start w:val="single" w:sz="4" w:space="0" w:color="000000"/>
               <w:bottom w:val="single" w:sz="4" w:space="0" w:color="000000"/>
@@ -270,7 +270,7 @@
         </w:tc>
         <w:tc>
           <w:tcPr>
-            <w:tcW w:w="1940" w:type="dxa"/>
+            <w:tcW w:w="1941" w:type="dxa"/>
             <w:tcBorders>
               <w:start w:val="single" w:sz="4" w:space="0" w:color="000000"/>
               <w:bottom w:val="single" w:sz="4" w:space="0" w:color="000000"/>
@@ -358,7 +358,7 @@
         <w:trPr/>
         <w:tc>
           <w:tcPr>
-            <w:tcW w:w="1915" w:type="dxa"/>
+            <w:tcW w:w="1914" w:type="dxa"/>
             <w:tcBorders>
               <w:start w:val="single" w:sz="4" w:space="0" w:color="000000"/>
               <w:bottom w:val="single" w:sz="4" w:space="0" w:color="000000"/>
@@ -379,7 +379,7 @@
         </w:tc>
         <w:tc>
           <w:tcPr>
-            <w:tcW w:w="1940" w:type="dxa"/>
+            <w:tcW w:w="1941" w:type="dxa"/>
             <w:tcBorders>
               <w:start w:val="single" w:sz="4" w:space="0" w:color="000000"/>
               <w:bottom w:val="single" w:sz="4" w:space="0" w:color="000000"/>
@@ -467,7 +467,7 @@
         <w:trPr/>
         <w:tc>
           <w:tcPr>
-            <w:tcW w:w="1915" w:type="dxa"/>
+            <w:tcW w:w="1914" w:type="dxa"/>
             <w:tcBorders>
               <w:start w:val="single" w:sz="4" w:space="0" w:color="000000"/>
               <w:bottom w:val="single" w:sz="4" w:space="0" w:color="000000"/>
@@ -488,7 +488,7 @@
         </w:tc>
         <w:tc>
           <w:tcPr>
-            <w:tcW w:w="1940" w:type="dxa"/>
+            <w:tcW w:w="1941" w:type="dxa"/>
             <w:tcBorders>
               <w:start w:val="single" w:sz="4" w:space="0" w:color="000000"/>
               <w:bottom w:val="single" w:sz="4" w:space="0" w:color="000000"/>
@@ -586,7 +586,7 @@
         <w:trPr/>
         <w:tc>
           <w:tcPr>
-            <w:tcW w:w="1915" w:type="dxa"/>
+            <w:tcW w:w="1914" w:type="dxa"/>
             <w:tcBorders>
               <w:start w:val="single" w:sz="4" w:space="0" w:color="000000"/>
               <w:bottom w:val="single" w:sz="4" w:space="0" w:color="000000"/>
@@ -607,7 +607,7 @@
         </w:tc>
         <w:tc>
           <w:tcPr>
-            <w:tcW w:w="1940" w:type="dxa"/>
+            <w:tcW w:w="1941" w:type="dxa"/>
             <w:tcBorders>
               <w:start w:val="single" w:sz="4" w:space="0" w:color="000000"/>
               <w:bottom w:val="single" w:sz="4" w:space="0" w:color="000000"/>
@@ -703,7 +703,7 @@
         <w:trPr/>
         <w:tc>
           <w:tcPr>
-            <w:tcW w:w="1915" w:type="dxa"/>
+            <w:tcW w:w="1914" w:type="dxa"/>
             <w:tcBorders>
               <w:start w:val="single" w:sz="4" w:space="0" w:color="000000"/>
               <w:bottom w:val="single" w:sz="4" w:space="0" w:color="000000"/>
@@ -724,7 +724,7 @@
         </w:tc>
         <w:tc>
           <w:tcPr>
-            <w:tcW w:w="1940" w:type="dxa"/>
+            <w:tcW w:w="1941" w:type="dxa"/>
             <w:tcBorders>
               <w:start w:val="single" w:sz="4" w:space="0" w:color="000000"/>
               <w:bottom w:val="single" w:sz="4" w:space="0" w:color="000000"/>
@@ -820,7 +820,7 @@
         <w:trPr/>
         <w:tc>
           <w:tcPr>
-            <w:tcW w:w="1915" w:type="dxa"/>
+            <w:tcW w:w="1914" w:type="dxa"/>
             <w:tcBorders>
               <w:start w:val="single" w:sz="4" w:space="0" w:color="000000"/>
               <w:bottom w:val="single" w:sz="4" w:space="0" w:color="000000"/>
@@ -841,7 +841,7 @@
         </w:tc>
         <w:tc>
           <w:tcPr>
-            <w:tcW w:w="1940" w:type="dxa"/>
+            <w:tcW w:w="1941" w:type="dxa"/>
             <w:tcBorders>
               <w:start w:val="single" w:sz="4" w:space="0" w:color="000000"/>
               <w:bottom w:val="single" w:sz="4" w:space="0" w:color="000000"/>
@@ -929,7 +929,7 @@
         <w:trPr/>
         <w:tc>
           <w:tcPr>
-            <w:tcW w:w="1915" w:type="dxa"/>
+            <w:tcW w:w="1914" w:type="dxa"/>
             <w:tcBorders>
               <w:start w:val="single" w:sz="4" w:space="0" w:color="000000"/>
               <w:bottom w:val="single" w:sz="4" w:space="0" w:color="000000"/>
@@ -950,7 +950,7 @@
         </w:tc>
         <w:tc>
           <w:tcPr>
-            <w:tcW w:w="1940" w:type="dxa"/>
+            <w:tcW w:w="1941" w:type="dxa"/>
             <w:tcBorders>
               <w:start w:val="single" w:sz="4" w:space="0" w:color="000000"/>
               <w:bottom w:val="single" w:sz="4" w:space="0" w:color="000000"/>
@@ -1464,6 +1464,7 @@
           <w:bCs/>
         </w:rPr>
       </w:pPr>
+      <w:bookmarkStart w:id="12" w:name="__DdeLink__568_930775423"/>
       <w:r>
         <w:rPr>
           <w:b/>
@@ -1471,6 +1472,7 @@
         </w:rPr>
         <w:t>Comment Arrangement Algorithm</w:t>
       </w:r>
+      <w:bookmarkEnd w:id="12"/>
     </w:p>
     <w:p>
       <w:pPr>
@@ -1575,7 +1577,7 @@
           <w:b w:val="false"/>
           <w:bCs w:val="false"/>
         </w:rPr>
-        <w:t>When the inner loop finds another comment with a NULL parent_id, then we bereak out of the inner loop and proceed to the outer loop to begin all over again.</w:t>
+        <w:t>When the inner loop finds another comment with a NULL parent_id, then we break out of the inner loop and proceed to the outer loop to begin all over again.</w:t>
       </w:r>
     </w:p>
     <w:p>
@@ -1639,6 +1641,149 @@
           <w:b/>
           <w:bCs/>
         </w:rPr>
+        <w:t>Alternate Comment Arrangement Algorithm</w:t>
+      </w:r>
+    </w:p>
+    <w:p>
+      <w:pPr>
+        <w:pStyle w:val="Normal"/>
+        <w:bidi w:val="0"/>
+        <w:jc w:val="both"/>
+        <w:rPr>
+          <w:b w:val="false"/>
+          <w:bCs w:val="false"/>
+        </w:rPr>
+      </w:pPr>
+      <w:r>
+        <w:rPr>
+          <w:b w:val="false"/>
+          <w:bCs w:val="false"/>
+        </w:rPr>
+        <w:t>Create a main array.</w:t>
+      </w:r>
+    </w:p>
+    <w:p>
+      <w:pPr>
+        <w:pStyle w:val="Normal"/>
+        <w:bidi w:val="0"/>
+        <w:jc w:val="both"/>
+        <w:rPr>
+          <w:b w:val="false"/>
+          <w:bCs w:val="false"/>
+        </w:rPr>
+      </w:pPr>
+      <w:r>
+        <w:rPr>
+          <w:b w:val="false"/>
+          <w:bCs w:val="false"/>
+        </w:rPr>
+        <w:t>Put the first child-less comment and all its children in the first sub-array.</w:t>
+      </w:r>
+    </w:p>
+    <w:p>
+      <w:pPr>
+        <w:pStyle w:val="Normal"/>
+        <w:bidi w:val="0"/>
+        <w:jc w:val="both"/>
+        <w:rPr>
+          <w:b w:val="false"/>
+          <w:bCs w:val="false"/>
+        </w:rPr>
+      </w:pPr>
+      <w:r>
+        <w:rPr>
+          <w:b w:val="false"/>
+          <w:bCs w:val="false"/>
+        </w:rPr>
+        <w:t>Put the second child-less comment and all its children in the second sub-array.</w:t>
+      </w:r>
+    </w:p>
+    <w:p>
+      <w:pPr>
+        <w:pStyle w:val="Normal"/>
+        <w:bidi w:val="0"/>
+        <w:jc w:val="both"/>
+        <w:rPr>
+          <w:b w:val="false"/>
+          <w:bCs w:val="false"/>
+        </w:rPr>
+      </w:pPr>
+      <w:r>
+        <w:rPr>
+          <w:b w:val="false"/>
+          <w:bCs w:val="false"/>
+        </w:rPr>
+        <w:t>And so on.</w:t>
+      </w:r>
+    </w:p>
+    <w:p>
+      <w:pPr>
+        <w:pStyle w:val="Normal"/>
+        <w:bidi w:val="0"/>
+        <w:jc w:val="both"/>
+        <w:rPr>
+          <w:b w:val="false"/>
+          <w:bCs w:val="false"/>
+        </w:rPr>
+      </w:pPr>
+      <w:r>
+        <w:rPr>
+          <w:b w:val="false"/>
+          <w:bCs w:val="false"/>
+        </w:rPr>
+      </w:r>
+    </w:p>
+    <w:p>
+      <w:pPr>
+        <w:pStyle w:val="Normal"/>
+        <w:bidi w:val="0"/>
+        <w:jc w:val="both"/>
+        <w:rPr>
+          <w:b w:val="false"/>
+          <w:bCs w:val="false"/>
+        </w:rPr>
+      </w:pPr>
+      <w:r>
+        <w:rPr>
+          <w:b w:val="false"/>
+          <w:bCs w:val="false"/>
+        </w:rPr>
+        <w:t>Create an empty 2D array.</w:t>
+      </w:r>
+    </w:p>
+    <w:p>
+      <w:pPr>
+        <w:pStyle w:val="Normal"/>
+        <w:bidi w:val="0"/>
+        <w:jc w:val="both"/>
+        <w:rPr>
+          <w:b w:val="false"/>
+          <w:bCs w:val="false"/>
+        </w:rPr>
+      </w:pPr>
+      <w:r>
+        <w:rPr>
+          <w:b w:val="false"/>
+          <w:bCs w:val="false"/>
+        </w:rPr>
+        <w:t>Create a temporary array variable.</w:t>
+      </w:r>
+    </w:p>
+    <w:p>
+      <w:pPr>
+        <w:pStyle w:val="Normal"/>
+        <w:bidi w:val="0"/>
+        <w:jc w:val="both"/>
+        <w:rPr>
+          <w:b w:val="false"/>
+          <w:bCs w:val="false"/>
+        </w:rPr>
+      </w:pPr>
+      <w:r>
+        <w:rPr>
+          <w:b w:val="false"/>
+          <w:bCs w:val="false"/>
+        </w:rPr>
       </w:r>
     </w:p>
     <w:p>
@@ -1829,7 +1974,7 @@
         </w:rPr>
         <w:t xml:space="preserve">* Attempt to create a COMMENT for an existing USER, but for a POST that does not exist using createComment. This comment will attempt to be created with </w:t>
       </w:r>
-      <w:bookmarkStart w:id="12" w:name="__DdeLink__200_3513732324"/>
+      <w:bookmarkStart w:id="13" w:name="__DdeLink__200_3513732324"/>
       <w:r>
         <w:rPr>
           <w:b w:val="false"/>
@@ -1837,8 +1982,8 @@
         </w:rPr>
         <w:t xml:space="preserve">( comment_content, comment_is_deleted, post_id, user_id, parent_id) {“Test Comment with comment_id 17”, false, 34, 7, NULL}. </w:t>
       </w:r>
-      <w:bookmarkStart w:id="13" w:name="__DdeLink__202_3513732324"/>
-      <w:bookmarkEnd w:id="12"/>
+      <w:bookmarkStart w:id="14" w:name="__DdeLink__202_3513732324"/>
+      <w:bookmarkEnd w:id="13"/>
       <w:r>
         <w:rPr>
           <w:b w:val="false"/>
@@ -1846,7 +1991,7 @@
         </w:rPr>
         <w:t>We should expect this test to fail with an exception. This is a test of referential integrity.</w:t>
       </w:r>
-      <w:bookmarkEnd w:id="13"/>
+      <w:bookmarkEnd w:id="14"/>
     </w:p>
     <w:p>
       <w:pPr>
@@ -1917,7 +2062,7 @@
         </w:rPr>
         <w:t xml:space="preserve">* Attempt to update a COMMENT’s comment_content that doesn’t exist using updateCommentContent {“comment_content”: “UPDATED test comment with comment_id 19”}. The non-existent comment will have a comment_id of 19. </w:t>
       </w:r>
-      <w:bookmarkStart w:id="14" w:name="__DdeLink__204_3513732324"/>
+      <w:bookmarkStart w:id="15" w:name="__DdeLink__204_3513732324"/>
       <w:r>
         <w:rPr>
           <w:b w:val="false"/>
@@ -1925,7 +2070,7 @@
         </w:rPr>
         <w:t>We should expect this test to fail with an exception. We are testing a sad path for updateCommentContent here.</w:t>
       </w:r>
-      <w:bookmarkEnd w:id="14"/>
+      <w:bookmarkEnd w:id="15"/>
     </w:p>
     <w:p>
       <w:pPr>
@@ -1961,7 +2106,7 @@
         </w:rPr>
         <w:t xml:space="preserve">* Attempt to soft-delete a </w:t>
       </w:r>
-      <w:bookmarkStart w:id="15" w:name="__DdeLink__206_3513732324"/>
+      <w:bookmarkStart w:id="16" w:name="__DdeLink__206_3513732324"/>
       <w:r>
         <w:rPr>
           <w:b w:val="false"/>
@@ -1969,7 +2114,7 @@
         </w:rPr>
         <w:t xml:space="preserve">COMMENT that doesn’t exist using softDeleteComment. We assume that this comment has a comment_id of 19. </w:t>
       </w:r>
-      <w:bookmarkEnd w:id="15"/>
+      <w:bookmarkEnd w:id="16"/>
       <w:r>
         <w:rPr>
           <w:b w:val="false"/>
@@ -1977,7 +2122,7 @@
         </w:rPr>
         <w:t xml:space="preserve">{“comment_is_deleted”: true}. </w:t>
       </w:r>
-      <w:bookmarkStart w:id="16" w:name="__DdeLink__208_3513732324"/>
+      <w:bookmarkStart w:id="17" w:name="__DdeLink__208_3513732324"/>
       <w:r>
         <w:rPr>
           <w:b w:val="false"/>
@@ -1985,7 +2130,7 @@
         </w:rPr>
         <w:t>We should expect this test to fail with an exception. We are testing a sad path for softDeleteComment here.</w:t>
       </w:r>
-      <w:bookmarkEnd w:id="16"/>
+      <w:bookmarkEnd w:id="17"/>
     </w:p>
     <w:p>
       <w:pPr>
@@ -2021,7 +2166,7 @@
         </w:rPr>
         <w:t>* Attempt to hard delete a COMMENT that doesn’t exist using hardDeleteComment. We assume that this comment has a comment_id of 19.</w:t>
       </w:r>
-      <w:bookmarkStart w:id="17" w:name="__DdeLink__210_3513732324"/>
+      <w:bookmarkStart w:id="18" w:name="__DdeLink__210_3513732324"/>
       <w:r>
         <w:rPr>
           <w:b w:val="false"/>
@@ -2029,7 +2174,7 @@
         </w:rPr>
         <w:t xml:space="preserve"> </w:t>
       </w:r>
-      <w:bookmarkStart w:id="18" w:name="__DdeLink__212_3513732324"/>
+      <w:bookmarkStart w:id="19" w:name="__DdeLink__212_3513732324"/>
       <w:r>
         <w:rPr>
           <w:b w:val="false"/>
@@ -2037,15 +2182,15 @@
         </w:rPr>
         <w:t xml:space="preserve">We should expect this test to fail with an exception. </w:t>
       </w:r>
+      <w:bookmarkEnd w:id="19"/>
+      <w:r>
+        <w:rPr>
+          <w:b w:val="false"/>
+          <w:bCs w:val="false"/>
+        </w:rPr>
+        <w:t>We are testing a sad path for softDeleteComment here.</w:t>
+      </w:r>
       <w:bookmarkEnd w:id="18"/>
-      <w:r>
-        <w:rPr>
-          <w:b w:val="false"/>
-          <w:bCs w:val="false"/>
-        </w:rPr>
-        <w:t>We are testing a sad path for softDeleteComment here.</w:t>
-      </w:r>
-      <w:bookmarkEnd w:id="17"/>
     </w:p>
     <w:p>
       <w:pPr>
@@ -2081,7 +2226,7 @@
         </w:rPr>
         <w:t>* Attempt to display all COMMENTs from a POST that doesn’t exist using displayAllPostComments. We assume that this POST has a post_id of 28</w:t>
       </w:r>
-      <w:bookmarkStart w:id="19" w:name="__DdeLink__214_3513732324"/>
+      <w:bookmarkStart w:id="20" w:name="__DdeLink__214_3513732324"/>
       <w:r>
         <w:rPr>
           <w:b w:val="false"/>
@@ -2089,8 +2234,8 @@
         </w:rPr>
         <w:t xml:space="preserve">. We should expect this test to fail with an exception. </w:t>
       </w:r>
-      <w:bookmarkStart w:id="20" w:name="__DdeLink__216_3513732324"/>
-      <w:bookmarkEnd w:id="19"/>
+      <w:bookmarkStart w:id="21" w:name="__DdeLink__216_3513732324"/>
+      <w:bookmarkEnd w:id="20"/>
       <w:r>
         <w:rPr>
           <w:b w:val="false"/>
@@ -2098,7 +2243,7 @@
         </w:rPr>
         <w:t>We are testing a sad path for displayAllPostComments here.</w:t>
       </w:r>
-      <w:bookmarkEnd w:id="20"/>
+      <w:bookmarkEnd w:id="21"/>
     </w:p>
     <w:p>
       <w:pPr>
@@ -2134,7 +2279,7 @@
         </w:rPr>
         <w:t xml:space="preserve">* Attempt to search COMMENTs in a POST that doesn’t exist using searchCommentsByPost. We assume that this POST has a post_id of 28. </w:t>
       </w:r>
-      <w:bookmarkStart w:id="21" w:name="__DdeLink__218_3513732324"/>
+      <w:bookmarkStart w:id="22" w:name="__DdeLink__218_3513732324"/>
       <w:r>
         <w:rPr>
           <w:b w:val="false"/>
@@ -2142,70 +2287,46 @@
         </w:rPr>
         <w:t>We should expect this test to fail with an exception. We are testing a sad path for searchCommentsByPost here.</w:t>
       </w:r>
-      <w:bookmarkEnd w:id="21"/>
-    </w:p>
-    <w:p>
-      <w:pPr>
-        <w:pStyle w:val="Normal"/>
-        <w:bidi w:val="0"/>
-        <w:jc w:val="both"/>
-        <w:rPr>
-          <w:b w:val="false"/>
-          <w:bCs w:val="false"/>
-        </w:rPr>
-      </w:pPr>
-      <w:r>
-        <w:rPr>
-          <w:b w:val="false"/>
-          <w:bCs w:val="false"/>
-        </w:rPr>
-      </w:r>
-    </w:p>
-    <w:p>
-      <w:pPr>
-        <w:pStyle w:val="Normal"/>
-        <w:bidi w:val="0"/>
-        <w:jc w:val="both"/>
-        <w:rPr>
-          <w:b w:val="false"/>
-          <w:bCs w:val="false"/>
-        </w:rPr>
-      </w:pPr>
-      <w:r>
-        <w:rPr>
-          <w:b w:val="false"/>
-          <w:bCs w:val="false"/>
-        </w:rPr>
-        <w:t xml:space="preserve">* Attempt to create a reply to a COMMENT that doesn’t exist </w:t>
-      </w:r>
-      <w:r>
-        <w:rPr>
-          <w:b w:val="false"/>
-          <w:bCs w:val="false"/>
-        </w:rPr>
-        <w:t xml:space="preserve">using createReply. We assume that this COMMENT to which the reply is being created has a comment_id of 19. </w:t>
-      </w:r>
-      <w:r>
-        <w:rPr>
-          <w:b w:val="false"/>
-          <w:bCs w:val="false"/>
-        </w:rPr>
-        <w:t xml:space="preserve">We should expect this test to fail with an exception. We are testing a sad path for </w:t>
-      </w:r>
-      <w:r>
-        <w:rPr>
-          <w:b w:val="false"/>
-          <w:bCs w:val="false"/>
-        </w:rPr>
-        <w:t>createReply</w:t>
-      </w:r>
-      <w:r>
-        <w:rPr>
-          <w:b w:val="false"/>
-          <w:bCs w:val="false"/>
-        </w:rPr>
-        <w:t xml:space="preserve"> here.</w:t>
-      </w:r>
+      <w:bookmarkEnd w:id="22"/>
+    </w:p>
+    <w:p>
+      <w:pPr>
+        <w:pStyle w:val="Normal"/>
+        <w:bidi w:val="0"/>
+        <w:jc w:val="both"/>
+        <w:rPr>
+          <w:b w:val="false"/>
+          <w:bCs w:val="false"/>
+        </w:rPr>
+      </w:pPr>
+      <w:r>
+        <w:rPr>
+          <w:b w:val="false"/>
+          <w:bCs w:val="false"/>
+        </w:rPr>
+      </w:r>
+    </w:p>
+    <w:p>
+      <w:pPr>
+        <w:pStyle w:val="Normal"/>
+        <w:bidi w:val="0"/>
+        <w:jc w:val="both"/>
+        <w:rPr>
+          <w:b w:val="false"/>
+          <w:bCs w:val="false"/>
+        </w:rPr>
+      </w:pPr>
+      <w:bookmarkStart w:id="23" w:name="__DdeLink__243_3513732324"/>
+      <w:bookmarkStart w:id="24" w:name="__DdeLink__230_3513732324"/>
+      <w:r>
+        <w:rPr>
+          <w:b w:val="false"/>
+          <w:bCs w:val="false"/>
+        </w:rPr>
+        <w:t>* Attempt to create a reply to a COMMENT that doesn’t exist using createReply. We assume that this COMMENT to which the reply is being created has a comment_id of 19. We should expect this test to fail with an exception. We are testing a sad path for createReply here.</w:t>
+      </w:r>
+      <w:bookmarkEnd w:id="23"/>
+      <w:bookmarkEnd w:id="24"/>
     </w:p>
     <w:p>
       <w:pPr>

</xml_diff>